<commit_message>
Add week 2 pandas notebook, a dataset and updated logbook for week 2
</commit_message>
<xml_diff>
--- a/LABlogbook.docx
+++ b/LABlogbook.docx
@@ -15,6 +15,47 @@
           <w:sz w:val="56"/>
           <w:szCs w:val="56"/>
         </w:rPr>
+        <w:drawing>
+          <wp:inline distT="0" distB="0" distL="0" distR="0" wp14:anchorId="16D6766E" wp14:editId="12E89DAB">
+            <wp:extent cx="5731510" cy="1844040"/>
+            <wp:effectExtent l="0" t="0" r="2540" b="3810"/>
+            <wp:docPr id="1679006924" name="Picture 1"/>
+            <wp:cNvGraphicFramePr>
+              <a:graphicFrameLocks xmlns:a="http://schemas.openxmlformats.org/drawingml/2006/main" noChangeAspect="1"/>
+            </wp:cNvGraphicFramePr>
+            <a:graphic xmlns:a="http://schemas.openxmlformats.org/drawingml/2006/main">
+              <a:graphicData uri="http://schemas.openxmlformats.org/drawingml/2006/picture">
+                <pic:pic xmlns:pic="http://schemas.openxmlformats.org/drawingml/2006/picture">
+                  <pic:nvPicPr>
+                    <pic:cNvPr id="1679006924" name=""/>
+                    <pic:cNvPicPr/>
+                  </pic:nvPicPr>
+                  <pic:blipFill>
+                    <a:blip r:embed="rId4"/>
+                    <a:stretch>
+                      <a:fillRect/>
+                    </a:stretch>
+                  </pic:blipFill>
+                  <pic:spPr>
+                    <a:xfrm>
+                      <a:off x="0" y="0"/>
+                      <a:ext cx="5731510" cy="1844040"/>
+                    </a:xfrm>
+                    <a:prstGeom prst="rect">
+                      <a:avLst/>
+                    </a:prstGeom>
+                  </pic:spPr>
+                </pic:pic>
+              </a:graphicData>
+            </a:graphic>
+          </wp:inline>
+        </w:drawing>
+      </w:r>
+      <w:r>
+        <w:rPr>
+          <w:sz w:val="56"/>
+          <w:szCs w:val="56"/>
+        </w:rPr>
         <w:t>LAB Logbook</w:t>
       </w:r>
     </w:p>
@@ -50,29 +91,20 @@
           <w:szCs w:val="44"/>
           <w:u w:val="single"/>
         </w:rPr>
-        <w:t xml:space="preserve">- </w:t>
-      </w:r>
-      <w:proofErr w:type="spellStart"/>
-      <w:r>
-        <w:rPr>
-          <w:sz w:val="44"/>
-          <w:szCs w:val="44"/>
-          <w:u w:val="single"/>
-        </w:rPr>
-        <w:t>Numpy</w:t>
-      </w:r>
-      <w:proofErr w:type="spellEnd"/>
-    </w:p>
-    <w:p>
-      <w:pPr>
-        <w:jc w:val="both"/>
-        <w:rPr>
-          <w:sz w:val="44"/>
-          <w:szCs w:val="44"/>
-        </w:rPr>
-      </w:pPr>
-      <w:r>
-        <w:rPr>
+        <w:t>- Numpy</w:t>
+      </w:r>
+    </w:p>
+    <w:p>
+      <w:pPr>
+        <w:jc w:val="both"/>
+        <w:rPr>
+          <w:sz w:val="44"/>
+          <w:szCs w:val="44"/>
+        </w:rPr>
+      </w:pPr>
+      <w:r>
+        <w:rPr>
+          <w:noProof/>
           <w:sz w:val="44"/>
           <w:szCs w:val="44"/>
         </w:rPr>
@@ -92,7 +124,7 @@
                     <pic:cNvPicPr/>
                   </pic:nvPicPr>
                   <pic:blipFill>
-                    <a:blip r:embed="rId4"/>
+                    <a:blip r:embed="rId5"/>
                     <a:stretch>
                       <a:fillRect/>
                     </a:stretch>
@@ -150,6 +182,153 @@
           <w:u w:val="single"/>
         </w:rPr>
       </w:pPr>
+      <w:r>
+        <w:rPr>
+          <w:sz w:val="44"/>
+          <w:szCs w:val="44"/>
+          <w:u w:val="single"/>
+        </w:rPr>
+        <w:drawing>
+          <wp:inline distT="0" distB="0" distL="0" distR="0" wp14:anchorId="402C774B" wp14:editId="102B7D6E">
+            <wp:extent cx="5731510" cy="1844040"/>
+            <wp:effectExtent l="0" t="0" r="2540" b="3810"/>
+            <wp:docPr id="1947358868" name="Picture 1"/>
+            <wp:cNvGraphicFramePr>
+              <a:graphicFrameLocks xmlns:a="http://schemas.openxmlformats.org/drawingml/2006/main" noChangeAspect="1"/>
+            </wp:cNvGraphicFramePr>
+            <a:graphic xmlns:a="http://schemas.openxmlformats.org/drawingml/2006/main">
+              <a:graphicData uri="http://schemas.openxmlformats.org/drawingml/2006/picture">
+                <pic:pic xmlns:pic="http://schemas.openxmlformats.org/drawingml/2006/picture">
+                  <pic:nvPicPr>
+                    <pic:cNvPr id="1947358868" name=""/>
+                    <pic:cNvPicPr/>
+                  </pic:nvPicPr>
+                  <pic:blipFill>
+                    <a:blip r:embed="rId4"/>
+                    <a:stretch>
+                      <a:fillRect/>
+                    </a:stretch>
+                  </pic:blipFill>
+                  <pic:spPr>
+                    <a:xfrm>
+                      <a:off x="0" y="0"/>
+                      <a:ext cx="5731510" cy="1844040"/>
+                    </a:xfrm>
+                    <a:prstGeom prst="rect">
+                      <a:avLst/>
+                    </a:prstGeom>
+                  </pic:spPr>
+                </pic:pic>
+              </a:graphicData>
+            </a:graphic>
+          </wp:inline>
+        </w:drawing>
+      </w:r>
+    </w:p>
+    <w:p>
+      <w:pPr>
+        <w:jc w:val="both"/>
+        <w:rPr>
+          <w:sz w:val="44"/>
+          <w:szCs w:val="44"/>
+          <w:u w:val="single"/>
+        </w:rPr>
+      </w:pPr>
+      <w:r>
+        <w:rPr>
+          <w:sz w:val="44"/>
+          <w:szCs w:val="44"/>
+          <w:u w:val="single"/>
+        </w:rPr>
+        <w:lastRenderedPageBreak/>
+        <w:drawing>
+          <wp:inline distT="0" distB="0" distL="0" distR="0" wp14:anchorId="19C1E2E5" wp14:editId="3E2A36F2">
+            <wp:extent cx="3029106" cy="3473629"/>
+            <wp:effectExtent l="0" t="0" r="0" b="0"/>
+            <wp:docPr id="1084926917" name="Picture 1"/>
+            <wp:cNvGraphicFramePr>
+              <a:graphicFrameLocks xmlns:a="http://schemas.openxmlformats.org/drawingml/2006/main" noChangeAspect="1"/>
+            </wp:cNvGraphicFramePr>
+            <a:graphic xmlns:a="http://schemas.openxmlformats.org/drawingml/2006/main">
+              <a:graphicData uri="http://schemas.openxmlformats.org/drawingml/2006/picture">
+                <pic:pic xmlns:pic="http://schemas.openxmlformats.org/drawingml/2006/picture">
+                  <pic:nvPicPr>
+                    <pic:cNvPr id="1084926917" name=""/>
+                    <pic:cNvPicPr/>
+                  </pic:nvPicPr>
+                  <pic:blipFill>
+                    <a:blip r:embed="rId6"/>
+                    <a:stretch>
+                      <a:fillRect/>
+                    </a:stretch>
+                  </pic:blipFill>
+                  <pic:spPr>
+                    <a:xfrm>
+                      <a:off x="0" y="0"/>
+                      <a:ext cx="3029106" cy="3473629"/>
+                    </a:xfrm>
+                    <a:prstGeom prst="rect">
+                      <a:avLst/>
+                    </a:prstGeom>
+                  </pic:spPr>
+                </pic:pic>
+              </a:graphicData>
+            </a:graphic>
+          </wp:inline>
+        </w:drawing>
+      </w:r>
+    </w:p>
+    <w:p>
+      <w:pPr>
+        <w:jc w:val="both"/>
+        <w:rPr>
+          <w:sz w:val="44"/>
+          <w:szCs w:val="44"/>
+          <w:u w:val="single"/>
+        </w:rPr>
+      </w:pPr>
+      <w:r>
+        <w:rPr>
+          <w:sz w:val="44"/>
+          <w:szCs w:val="44"/>
+          <w:u w:val="single"/>
+        </w:rPr>
+        <w:drawing>
+          <wp:inline distT="0" distB="0" distL="0" distR="0" wp14:anchorId="1FE0ECC7" wp14:editId="12E863DD">
+            <wp:extent cx="2921150" cy="3143412"/>
+            <wp:effectExtent l="0" t="0" r="0" b="0"/>
+            <wp:docPr id="1494633369" name="Picture 1"/>
+            <wp:cNvGraphicFramePr>
+              <a:graphicFrameLocks xmlns:a="http://schemas.openxmlformats.org/drawingml/2006/main" noChangeAspect="1"/>
+            </wp:cNvGraphicFramePr>
+            <a:graphic xmlns:a="http://schemas.openxmlformats.org/drawingml/2006/main">
+              <a:graphicData uri="http://schemas.openxmlformats.org/drawingml/2006/picture">
+                <pic:pic xmlns:pic="http://schemas.openxmlformats.org/drawingml/2006/picture">
+                  <pic:nvPicPr>
+                    <pic:cNvPr id="1494633369" name=""/>
+                    <pic:cNvPicPr/>
+                  </pic:nvPicPr>
+                  <pic:blipFill>
+                    <a:blip r:embed="rId7"/>
+                    <a:stretch>
+                      <a:fillRect/>
+                    </a:stretch>
+                  </pic:blipFill>
+                  <pic:spPr>
+                    <a:xfrm>
+                      <a:off x="0" y="0"/>
+                      <a:ext cx="2921150" cy="3143412"/>
+                    </a:xfrm>
+                    <a:prstGeom prst="rect">
+                      <a:avLst/>
+                    </a:prstGeom>
+                  </pic:spPr>
+                </pic:pic>
+              </a:graphicData>
+            </a:graphic>
+          </wp:inline>
+        </w:drawing>
+      </w:r>
     </w:p>
     <w:p>
       <w:pPr>
@@ -222,6 +401,7 @@
           <w:szCs w:val="44"/>
           <w:u w:val="single"/>
         </w:rPr>
+        <w:lastRenderedPageBreak/>
         <w:t>Lab 5</w:t>
       </w:r>
     </w:p>

</xml_diff>